<commit_message>
feat(worksheet): move prompt fixes to source, remove the answer guide
Port the eight prompt-engineering fixes into src/worksheet.md instead of
the generated docs/ output, so a rebuild won't silently discard them.

Drop the answer guide entirely: the exercise output is experiential and
varies team to team, so a worked "correct answer" doesn't fit it. Removes
src/answer-guide.md, its build.sh steps, its manifest link, and every
generated artifact (root .docx/.html, docs/answer-guide-arm-bolt.html).
</commit_message>
<xml_diff>
--- a/Arm Bolt Worksheet.docx
+++ b/Arm Bolt Worksheet.docx
@@ -2123,6 +2123,51 @@
       </w:r>
     </w:p>
     <w:p>
+      <w:pPr>
+        <w:spacing w:after="130" w:line="276"/>
+      </w:pPr>
+      <w:r>
+        <w:rPr>
+          <w:rFonts w:ascii="Georgia" w:cs="Georgia" w:eastAsia="Georgia" w:hAnsi="Georgia"/>
+          <w:i w:val="false"/>
+          <w:iCs w:val="false"/>
+          <w:color w:val="1F2937"/>
+          <w:sz w:val="20"/>
+          <w:szCs w:val="20"/>
+        </w:rPr>
+        <w:t xml:space="preserve">One more thing before Phase 1: your chat doesn't know FTC or this codebase's rules yet. Paste this once, first, so every prompt below inherits it.</w:t>
+      </w:r>
+    </w:p>
+    <w:p>
+      <w:pPr>
+        <w:pBdr>
+          <w:left w:val="single" w:color="1F5D4C" w:sz="12" w:space="8"/>
+        </w:pBdr>
+        <w:spacing w:after="150" w:before="130" w:line="268"/>
+        <w:ind w:left="240"/>
+      </w:pPr>
+      <w:r>
+        <w:rPr>
+          <w:rFonts w:ascii="Trebuchet MS" w:cs="Trebuchet MS" w:eastAsia="Trebuchet MS" w:hAnsi="Trebuchet MS"/>
+          <w:b/>
+          <w:bCs/>
+          <w:color w:val="1F5D4C"/>
+          <w:sz w:val="18"/>
+          <w:szCs w:val="18"/>
+        </w:rPr>
+        <w:t xml:space="preserve">Prompt:  </w:t>
+      </w:r>
+      <w:r>
+        <w:rPr>
+          <w:rFonts w:ascii="Consolas" w:cs="Consolas" w:eastAsia="Consolas" w:hAnsi="Consolas"/>
+          <w:color w:val="1F2937"/>
+          <w:sz w:val="17"/>
+          <w:szCs w:val="17"/>
+        </w:rPr>
+        <w:t xml:space="preserve">We're adding to a working FTC robot, so read these before you answer anything. Nothing may change how an existing mechanism behaves. This file touches no hardware. It only calls methods that already exist in the files I paste — if you need one that isn't there, say so instead of writing it. Answer from my files, not from what FTC code usually looks like.</w:t>
+      </w:r>
+    </w:p>
+    <w:p>
       <w:r>
         <w:br w:type="page"/>
       </w:r>
@@ -2437,7 +2482,7 @@
           <w:sz w:val="17"/>
           <w:szCs w:val="17"/>
         </w:rPr>
-        <w:t xml:space="preserve">Our arm can already do [paste your vocabulary list]. We want it to [your objective]. Ask me what you need to know, one question at a time, then draft a short intent with a problem statement, success criteria and non-goals.</w:t>
+        <w:t xml:space="preserve">Our arm can already do [paste your vocabulary list]. We want it to [your objective]. Ask me what you need to know, one question at a time. Then draft a short intent under four headings: problem statement, success criteria, non-goals, and a loop-time budget in milliseconds. Everything shares one loop, so the budget is a constraint, not a footnote.</w:t>
       </w:r>
     </w:p>
     <w:tbl>
@@ -3177,7 +3222,7 @@
           <w:sz w:val="17"/>
           <w:szCs w:val="17"/>
         </w:rPr>
-        <w:t xml:space="preserve">Break this intent into 3–4 small stories, each with an acceptance criterion I could check by hand on the bench. Include one about loop time and one about what we'd log.</w:t>
+        <w:t xml:space="preserve">Here is our intent: [paste]. Break it into three small stories, each with one acceptance criterion I could check by hand on the bench — a clear yes or no, not "works properly." One story must be about loop time, one about what we'd log.</w:t>
       </w:r>
     </w:p>
     <w:tbl>
@@ -3882,7 +3927,7 @@
           <w:sz w:val="17"/>
           <w:szCs w:val="17"/>
         </w:rPr>
-        <w:t xml:space="preserve">Here is our state table: [paste]. For each row, check whether the exit condition names a method that actually exists in the files I gave you, and list any that do not. Then list the transitions we have not defined at all. Do not design it for us.</w:t>
+        <w:t xml:space="preserve">Here is our state table: [paste], and here are the files it calls into: [paste]. For each row, quote the line where the exit-condition method is declared, or say plainly that it isn't there. Then list the transitions we have not defined at all. Stop there — the design stays ours.</w:t>
       </w:r>
     </w:p>
     <w:tbl>
@@ -5093,7 +5138,7 @@
           <w:sz w:val="17"/>
           <w:szCs w:val="17"/>
         </w:rPr>
-        <w:t xml:space="preserve">Act as a reviewer, not an author. Here is our design: [paste]. What would break on real hardware, and what did we leave undefined? What happens if the driver interrupts halfway? List what is missing — do not fix anything.</w:t>
+        <w:t xml:space="preserve">Act as a reviewer, not an author. Here is our design: [paste], and here is our checklist: [paste]. For each checklist line say pass, fail, or can't-tell-from-this, and why. Then add anything that would break on real hardware that the list doesn't ask about, including a driver interrupting halfway. Findings only; the fixing is ours.</w:t>
       </w:r>
     </w:p>
     <w:p>
@@ -6027,6 +6072,51 @@
         </w:tc>
       </w:tr>
     </w:tbl>
+    <w:p>
+      <w:pPr>
+        <w:spacing w:after="130" w:line="276"/>
+      </w:pPr>
+      <w:r>
+        <w:rPr>
+          <w:rFonts w:ascii="Georgia" w:cs="Georgia" w:eastAsia="Georgia" w:hAnsi="Georgia"/>
+          <w:i w:val="false"/>
+          <w:iCs w:val="false"/>
+          <w:color w:val="1F2937"/>
+          <w:sz w:val="20"/>
+          <w:szCs w:val="20"/>
+        </w:rPr>
+        <w:t xml:space="preserve">If you set your dial to position 3</w:t>
+      </w:r>
+    </w:p>
+    <w:p>
+      <w:pPr>
+        <w:pBdr>
+          <w:left w:val="single" w:color="1F5D4C" w:sz="12" w:space="8"/>
+        </w:pBdr>
+        <w:spacing w:after="150" w:before="130" w:line="268"/>
+        <w:ind w:left="240"/>
+      </w:pPr>
+      <w:r>
+        <w:rPr>
+          <w:rFonts w:ascii="Trebuchet MS" w:cs="Trebuchet MS" w:eastAsia="Trebuchet MS" w:hAnsi="Trebuchet MS"/>
+          <w:b/>
+          <w:bCs/>
+          <w:color w:val="1F5D4C"/>
+          <w:sz w:val="18"/>
+          <w:szCs w:val="18"/>
+        </w:rPr>
+        <w:t xml:space="preserve">Prompt:  </w:t>
+      </w:r>
+      <w:r>
+        <w:rPr>
+          <w:rFonts w:ascii="Consolas" w:cs="Consolas" w:eastAsia="Consolas" w:hAnsi="Consolas"/>
+          <w:color w:val="1F2937"/>
+          <w:sz w:val="17"/>
+          <w:szCs w:val="17"/>
+        </w:rPr>
+        <w:t xml:space="preserve">Here is our state table and the file it goes in: [paste]. Write the whole FSM class from the table — every case, nothing the table doesn't call for. Then list, line by line, anything you had to decide that the table didn't tell you.</w:t>
+      </w:r>
+    </w:p>
     <w:tbl>
       <w:tblPr>
         <w:tblW w:type="dxa" w:w="9360"/>
@@ -7021,7 +7111,7 @@
           <w:sz w:val="17"/>
           <w:szCs w:val="17"/>
         </w:rPr>
-        <w:t xml:space="preserve">Here is my state table and my class so far: [paste]. Add ONLY the [next] case, matching that row exactly. Do not add other cases, do not refactor what is there, and do not add fields I have not declared.</w:t>
+        <w:t xml:space="preserve">Here is my state table and my class so far: [paste]. Add ONLY the case for [name one state from your table], matching that row exactly. Do not add other cases, refactor what is there, or add fields I have not declared. If the row names a method that isn't in what I pasted, stop and say so rather than inventing one.</w:t>
       </w:r>
     </w:p>
     <w:p>

</xml_diff>